<commit_message>
Publica template São José dos Campos por Pedro
</commit_message>
<xml_diff>
--- a/templates/sao_jose_dos_campos.docx
+++ b/templates/sao_jose_dos_campos.docx
@@ -11,7 +11,9 @@
         <w:rPr>
           <w:rFonts w:ascii="Arial" w:hAnsi="Arial" w:eastAsia="Arial" w:cs="Arial"/>
           <w:b/>
+          <w:i w:val="0"/>
           <w:sz w:val="20"/>
+          <w:u w:val="none"/>
         </w:rPr>
         <w:t>DECLARAÇÃO</w:t>
       </w:r>
@@ -25,20 +27,25 @@
         <w:rPr>
           <w:rFonts w:ascii="Arial" w:hAnsi="Arial" w:eastAsia="Arial" w:cs="Arial"/>
           <w:b w:val="0"/>
+          <w:i w:val="0"/>
           <w:sz w:val="20"/>
+          <w:u w:val="none"/>
         </w:rPr>
         <w:t>À</w:t>
       </w:r>
     </w:p>
     <w:p>
       <w:pPr>
+        <w:spacing w:before="0" w:after="0" w:line="240" w:lineRule="auto"/>
         <w:jc w:val="left"/>
       </w:pPr>
       <w:r>
         <w:rPr>
-          <w:rFonts w:ascii="Arial" w:hAnsi="Arial"/>
+          <w:rFonts w:ascii="Arial" w:hAnsi="Arial" w:eastAsia="Arial" w:cs="Arial"/>
           <w:b w:val="0"/>
-          <w:sz w:val="18"/>
+          <w:i w:val="0"/>
+          <w:sz w:val="20"/>
+          <w:u w:val="none"/>
         </w:rPr>
       </w:r>
     </w:p>
@@ -51,7 +58,9 @@
         <w:rPr>
           <w:rFonts w:ascii="Arial" w:hAnsi="Arial" w:eastAsia="Arial" w:cs="Arial"/>
           <w:b w:val="0"/>
+          <w:i w:val="0"/>
           <w:sz w:val="20"/>
+          <w:u w:val="none"/>
         </w:rPr>
         <w:t>SINDICATO DOS HOTÉIS, RESTAURANTES, BARES E SIMILARES DE SÃO JOSÉ DO CAMPO E REGIÃO</w:t>
       </w:r>
@@ -65,7 +74,9 @@
         <w:rPr>
           <w:rFonts w:ascii="Arial" w:hAnsi="Arial" w:eastAsia="Arial" w:cs="Arial"/>
           <w:b w:val="0"/>
+          <w:i w:val="0"/>
           <w:sz w:val="20"/>
+          <w:u w:val="none"/>
         </w:rPr>
         <w:t>e</w:t>
       </w:r>
@@ -79,41 +90,25 @@
         <w:rPr>
           <w:rFonts w:ascii="Arial" w:hAnsi="Arial" w:eastAsia="Arial" w:cs="Arial"/>
           <w:b w:val="0"/>
+          <w:i w:val="0"/>
           <w:sz w:val="20"/>
+          <w:u w:val="none"/>
         </w:rPr>
         <w:t>SINDICATO DOS TRABALHADORES EM HOTÉIS, RESTAURANTES, BARES E SIMILARES DE SÃO JOSÉ DOS CAMPOS E REGIÃO</w:t>
       </w:r>
     </w:p>
     <w:p>
       <w:pPr>
+        <w:spacing w:before="0" w:after="0" w:line="240" w:lineRule="auto"/>
         <w:jc w:val="left"/>
       </w:pPr>
       <w:r>
         <w:rPr>
-          <w:rFonts w:ascii="Arial" w:hAnsi="Arial"/>
+          <w:rFonts w:ascii="Arial" w:hAnsi="Arial" w:eastAsia="Arial" w:cs="Arial"/>
           <w:b w:val="0"/>
-          <w:sz w:val="18"/>
-        </w:rPr>
-      </w:r>
-    </w:p>
-    <w:p>
-      <w:pPr>
-        <w:spacing w:before="0" w:after="0" w:line="240" w:lineRule="auto"/>
-        <w:jc w:val="both"/>
-      </w:pPr>
-      <w:r>
-        <w:t>Declaramos que a empresa {{EMPRESA}} - {{CNPJ}} - CONTRATOU o {{BLOCO_BENEFICIOS}} conforme estipulado na Convenção Coletiva de Trabalho.</w:t>
-      </w:r>
-    </w:p>
-    <w:p>
-      <w:pPr>
-        <w:jc w:val="left"/>
-      </w:pPr>
-      <w:r>
-        <w:rPr>
-          <w:rFonts w:ascii="Arial" w:hAnsi="Arial"/>
-          <w:b w:val="0"/>
-          <w:sz w:val="18"/>
+          <w:i w:val="0"/>
+          <w:sz w:val="20"/>
+          <w:u w:val="none"/>
         </w:rPr>
       </w:r>
     </w:p>
@@ -126,20 +121,85 @@
         <w:rPr>
           <w:rFonts w:ascii="Arial" w:hAnsi="Arial" w:eastAsia="Arial" w:cs="Arial"/>
           <w:b w:val="0"/>
+          <w:i w:val="0"/>
           <w:sz w:val="20"/>
+          <w:u w:val="none"/>
         </w:rPr>
-        <w:t>Informamos que a apólice do Seguro de Vida e Telemedicina estão, atualmente, em processo de emissão junto à Seguradora. Tão logo estejam disponíveis, serão prontamente encaminhados ao e-mail do nosso estimado cliente.</w:t>
+        <w:t xml:space="preserve">Declaramos que a empresa </w:t>
+      </w:r>
+      <w:r>
+        <w:rPr>
+          <w:rFonts w:ascii="Arial" w:hAnsi="Arial" w:eastAsia="Arial" w:cs="Arial"/>
+          <w:b w:val="0"/>
+          <w:i w:val="0"/>
+          <w:sz w:val="20"/>
+          <w:u w:val="none"/>
+        </w:rPr>
+        <w:t>{{EMPRESA}}</w:t>
+      </w:r>
+      <w:r>
+        <w:rPr>
+          <w:rFonts w:ascii="Arial" w:hAnsi="Arial" w:eastAsia="Arial" w:cs="Arial"/>
+          <w:b w:val="0"/>
+          <w:i w:val="0"/>
+          <w:sz w:val="20"/>
+          <w:u w:val="none"/>
+        </w:rPr>
+        <w:t xml:space="preserve"> - </w:t>
+      </w:r>
+      <w:r>
+        <w:rPr>
+          <w:rFonts w:ascii="Arial" w:hAnsi="Arial" w:eastAsia="Arial" w:cs="Arial"/>
+          <w:b w:val="0"/>
+          <w:i w:val="0"/>
+          <w:sz w:val="20"/>
+          <w:u w:val="none"/>
+        </w:rPr>
+        <w:t>{{CNPJ}}</w:t>
+      </w:r>
+      <w:r>
+        <w:rPr>
+          <w:rFonts w:ascii="Arial" w:hAnsi="Arial" w:eastAsia="Arial" w:cs="Arial"/>
+          <w:b w:val="0"/>
+          <w:i w:val="0"/>
+          <w:sz w:val="20"/>
+          <w:u w:val="none"/>
+        </w:rPr>
+        <w:t xml:space="preserve"> - CONTRATOU o </w:t>
+      </w:r>
+      <w:r>
+        <w:rPr>
+          <w:rFonts w:ascii="Arial" w:hAnsi="Arial" w:eastAsia="Arial" w:cs="Arial"/>
+          <w:b w:val="0"/>
+          <w:i w:val="0"/>
+          <w:sz w:val="20"/>
+          <w:u w:val="none"/>
+        </w:rPr>
+        <w:t>{{BLOCO_BENEFICIOS}}</w:t>
+      </w:r>
+      <w:r>
+        <w:rPr>
+          <w:rFonts w:ascii="Arial" w:hAnsi="Arial" w:eastAsia="Arial" w:cs="Arial"/>
+          <w:b w:val="0"/>
+          <w:i w:val="0"/>
+          <w:sz w:val="20"/>
+          <w:u w:val="none"/>
+        </w:rPr>
+        <w:t xml:space="preserve"> , FORMULÁRIOS PRELIMINARES NR-1 conforme estipulado na Convenção Coletiva de Trabalho.</w:t>
       </w:r>
     </w:p>
     <w:p>
       <w:pPr>
+        <w:spacing w:before="0" w:after="0" w:line="240" w:lineRule="auto"/>
         <w:jc w:val="left"/>
       </w:pPr>
       <w:r>
         <w:rPr>
-          <w:rFonts w:ascii="Arial" w:hAnsi="Arial"/>
+          <w:rFonts w:ascii="Arial" w:hAnsi="Arial" w:eastAsia="Arial" w:cs="Arial"/>
           <w:b w:val="0"/>
-          <w:sz w:val="18"/>
+          <w:i w:val="0"/>
+          <w:sz w:val="20"/>
+          <w:u w:val="none"/>
         </w:rPr>
       </w:r>
     </w:p>
@@ -152,20 +212,25 @@
         <w:rPr>
           <w:rFonts w:ascii="Arial" w:hAnsi="Arial" w:eastAsia="Arial" w:cs="Arial"/>
           <w:b w:val="0"/>
+          <w:i w:val="0"/>
           <w:sz w:val="20"/>
+          <w:u w:val="none"/>
         </w:rPr>
-        <w:t>A adesão foi formalizada pelo pagamento do boleto realizado em {{PAGTO}},</w:t>
+        <w:t>Informamos que a apólice do Seguro de Vida com Formulários Preliminares NR-1 e Telemedicina estão, atualmente, em processo de emissão junto à Seguradora. Tão logo estejam disponíveis, serão prontamente encaminhados ao e-mail do nosso estimado cliente.</w:t>
       </w:r>
     </w:p>
     <w:p>
       <w:pPr>
+        <w:spacing w:before="0" w:after="0" w:line="240" w:lineRule="auto"/>
         <w:jc w:val="left"/>
       </w:pPr>
       <w:r>
         <w:rPr>
-          <w:rFonts w:ascii="Arial" w:hAnsi="Arial"/>
+          <w:rFonts w:ascii="Arial" w:hAnsi="Arial" w:eastAsia="Arial" w:cs="Arial"/>
           <w:b w:val="0"/>
-          <w:sz w:val="18"/>
+          <w:i w:val="0"/>
+          <w:sz w:val="20"/>
+          <w:u w:val="none"/>
         </w:rPr>
       </w:r>
     </w:p>
@@ -178,7 +243,60 @@
         <w:rPr>
           <w:rFonts w:ascii="Arial" w:hAnsi="Arial" w:eastAsia="Arial" w:cs="Arial"/>
           <w:b w:val="0"/>
+          <w:i w:val="0"/>
           <w:sz w:val="20"/>
+          <w:u w:val="none"/>
+        </w:rPr>
+        <w:t xml:space="preserve">A adesão foi formalizada pelo pagamento do boleto realizado em </w:t>
+      </w:r>
+      <w:r>
+        <w:rPr>
+          <w:rFonts w:ascii="Arial" w:hAnsi="Arial" w:eastAsia="Arial" w:cs="Arial"/>
+          <w:b w:val="0"/>
+          <w:i w:val="0"/>
+          <w:sz w:val="20"/>
+          <w:u w:val="none"/>
+        </w:rPr>
+        <w:t>{{PAGTO}}</w:t>
+      </w:r>
+      <w:r>
+        <w:rPr>
+          <w:rFonts w:ascii="Arial" w:hAnsi="Arial" w:eastAsia="Arial" w:cs="Arial"/>
+          <w:b w:val="0"/>
+          <w:i w:val="0"/>
+          <w:sz w:val="20"/>
+          <w:u w:val="none"/>
+        </w:rPr>
+        <w:t>,</w:t>
+      </w:r>
+    </w:p>
+    <w:p>
+      <w:pPr>
+        <w:spacing w:before="0" w:after="0" w:line="240" w:lineRule="auto"/>
+        <w:jc w:val="left"/>
+      </w:pPr>
+      <w:r>
+        <w:rPr>
+          <w:rFonts w:ascii="Arial" w:hAnsi="Arial" w:eastAsia="Arial" w:cs="Arial"/>
+          <w:b w:val="0"/>
+          <w:i w:val="0"/>
+          <w:sz w:val="20"/>
+          <w:u w:val="none"/>
+        </w:rPr>
+      </w:r>
+    </w:p>
+    <w:p>
+      <w:pPr>
+        <w:spacing w:before="0" w:after="0" w:line="240" w:lineRule="auto"/>
+        <w:jc w:val="both"/>
+      </w:pPr>
+      <w:r>
+        <w:rPr>
+          <w:rFonts w:ascii="Arial" w:hAnsi="Arial" w:eastAsia="Arial" w:cs="Arial"/>
+          <w:b w:val="0"/>
+          <w:i w:val="0"/>
+          <w:sz w:val="20"/>
+          <w:u w:val="none"/>
         </w:rPr>
         <w:t>O PLANO ESTÁ ATIVO PARA OS COLABORADORES ABAIXO:</w:t>
       </w:r>
@@ -192,20 +310,25 @@
         <w:rPr>
           <w:rFonts w:ascii="Arial" w:hAnsi="Arial" w:eastAsia="Arial" w:cs="Arial"/>
           <w:b w:val="0"/>
+          <w:i w:val="0"/>
           <w:sz w:val="20"/>
+          <w:u w:val="none"/>
         </w:rPr>
         <w:t>{{LISTA_ATIVOS}}</w:t>
       </w:r>
     </w:p>
     <w:p>
       <w:pPr>
+        <w:spacing w:before="0" w:after="0" w:line="240" w:lineRule="auto"/>
         <w:jc w:val="left"/>
       </w:pPr>
       <w:r>
         <w:rPr>
-          <w:rFonts w:ascii="Arial" w:hAnsi="Arial"/>
+          <w:rFonts w:ascii="Arial" w:hAnsi="Arial" w:eastAsia="Arial" w:cs="Arial"/>
           <w:b w:val="0"/>
-          <w:sz w:val="18"/>
+          <w:i w:val="0"/>
+          <w:sz w:val="20"/>
+          <w:u w:val="none"/>
         </w:rPr>
       </w:r>
     </w:p>
@@ -218,9 +341,21 @@
         <w:rPr>
           <w:rFonts w:ascii="Arial" w:hAnsi="Arial" w:eastAsia="Arial" w:cs="Arial"/>
           <w:b w:val="0"/>
+          <w:i w:val="0"/>
           <w:sz w:val="20"/>
+          <w:u w:val="none"/>
         </w:rPr>
-        <w:t>São Paulo, {{DATA_HOJE}}</w:t>
+        <w:t xml:space="preserve">São Paulo, </w:t>
+      </w:r>
+      <w:r>
+        <w:rPr>
+          <w:rFonts w:ascii="Arial" w:hAnsi="Arial" w:eastAsia="Arial" w:cs="Arial"/>
+          <w:b w:val="0"/>
+          <w:i w:val="0"/>
+          <w:sz w:val="20"/>
+          <w:u w:val="none"/>
+        </w:rPr>
+        <w:t>{{DATA_HOJE}}</w:t>
       </w:r>
     </w:p>
     <w:p>
@@ -232,7 +367,9 @@
         <w:rPr>
           <w:rFonts w:ascii="Arial" w:hAnsi="Arial" w:eastAsia="Arial" w:cs="Arial"/>
           <w:b w:val="0"/>
+          <w:i w:val="0"/>
           <w:sz w:val="20"/>
+          <w:u w:val="none"/>
         </w:rPr>
         <w:t>{{ASSINATURA}}</w:t>
       </w:r>

</xml_diff>